<commit_message>
Update Assignment 4 report with GitHub repo link
</commit_message>
<xml_diff>
--- a/Assignment4/Assignment4_Report_AbdulRehman.docx
+++ b/Assignment4/Assignment4_Report_AbdulRehman.docx
@@ -554,6 +554,21 @@
         <w:t>Purpose: Activating UFW logging ensures that any packets dropped by the 'default deny' policy or explicit deny rules are recorded in system logs (e.g., /var/log/ufw.log). This is critical for intrusion detection and monitoring unauthorized access attempts.</w:t>
       </w:r>
     </w:p>
+    <w:p/>
+    <w:p>
+      <w:r>
+        <w:rPr>
+          <w:b/>
+        </w:rPr>
+        <w:t xml:space="preserve">GitHub Repository: </w:t>
+      </w:r>
+      <w:r>
+        <w:rPr>
+          <w:color w:val="1976D2"/>
+        </w:rPr>
+        <w:t>https://github.com/muhaddasgujjar/CLO4-IDS-ML-Solution/tree/main/Assignment4</w:t>
+      </w:r>
+    </w:p>
     <w:sectPr>
       <w:pgSz w:w="12240" w:h="15840"/>
       <w:pgMar w:top="1134" w:right="1417" w:bottom="1134" w:left="1417" w:header="720" w:footer="720" w:gutter="0"/>

</xml_diff>